<commit_message>
Bootstrapping added on branch cos idk if bootstrapping best way to accomplish
</commit_message>
<xml_diff>
--- a/Original document.docx
+++ b/Original document.docx
@@ -37,7 +37,111 @@
         <w:t xml:space="preserve"> to look at risk adjusted returns.</w:t>
       </w:r>
     </w:p>
-    <w:p/>
+    <w:p>
+      <w:r>
+        <w:drawing>
+          <wp:inline distT="0" distB="0" distL="0" distR="0" wp14:anchorId="29B14141" wp14:editId="3702B3A5">
+            <wp:extent cx="5731510" cy="2042795"/>
+            <wp:effectExtent l="0" t="0" r="2540" b="0"/>
+            <wp:docPr id="996606785" name="Picture 1"/>
+            <wp:cNvGraphicFramePr>
+              <a:graphicFrameLocks xmlns:a="http://schemas.openxmlformats.org/drawingml/2006/main" noChangeAspect="1"/>
+            </wp:cNvGraphicFramePr>
+            <a:graphic xmlns:a="http://schemas.openxmlformats.org/drawingml/2006/main">
+              <a:graphicData uri="http://schemas.openxmlformats.org/drawingml/2006/picture">
+                <pic:pic xmlns:pic="http://schemas.openxmlformats.org/drawingml/2006/picture">
+                  <pic:nvPicPr>
+                    <pic:cNvPr id="996606785" name=""/>
+                    <pic:cNvPicPr/>
+                  </pic:nvPicPr>
+                  <pic:blipFill>
+                    <a:blip r:embed="rId6"/>
+                    <a:stretch>
+                      <a:fillRect/>
+                    </a:stretch>
+                  </pic:blipFill>
+                  <pic:spPr>
+                    <a:xfrm>
+                      <a:off x="0" y="0"/>
+                      <a:ext cx="5731510" cy="2042795"/>
+                    </a:xfrm>
+                    <a:prstGeom prst="rect">
+                      <a:avLst/>
+                    </a:prstGeom>
+                  </pic:spPr>
+                </pic:pic>
+              </a:graphicData>
+            </a:graphic>
+          </wp:inline>
+        </w:drawing>
+      </w:r>
+    </w:p>
+    <w:p>
+      <w:r>
+        <w:t xml:space="preserve">If we focus on the Sharpe Ratio and Sortino Ratio over this short period it does in isolation, suggest that there </w:t>
+      </w:r>
+      <w:r>
+        <w:t>is</w:t>
+      </w:r>
+      <w:r>
+        <w:t xml:space="preserve"> economically meaningful difference between 2013-2023</w:t>
+      </w:r>
+      <w:r>
+        <w:t xml:space="preserve"> and that Index Funds focusing on higher risk countries have far better risk adjusted returns but this is not enough to reject our hypothesis for many reasons. First,</w:t>
+      </w:r>
+      <w:r>
+        <w:t xml:space="preserve"> this is an incredibly short period and is based on point estimates which doesn’t establish a stat</w:t>
+      </w:r>
+      <w:r>
+        <w:t>istically significant divergence in risk-adjusted returns.</w:t>
+      </w:r>
+      <w:r>
+        <w:t xml:space="preserve"> Second, it doesn’t account for structural differences between the different funds such as market cap of the companies contained within the funds or the industry of business population the funds. </w:t>
+      </w:r>
+    </w:p>
+    <w:p>
+      <w:r>
+        <w:lastRenderedPageBreak/>
+        <w:drawing>
+          <wp:inline distT="0" distB="0" distL="0" distR="0" wp14:anchorId="41BB421C" wp14:editId="38DC9D02">
+            <wp:extent cx="5731510" cy="3054985"/>
+            <wp:effectExtent l="0" t="0" r="2540" b="0"/>
+            <wp:docPr id="1093486968" name="Picture 1"/>
+            <wp:cNvGraphicFramePr>
+              <a:graphicFrameLocks xmlns:a="http://schemas.openxmlformats.org/drawingml/2006/main" noChangeAspect="1"/>
+            </wp:cNvGraphicFramePr>
+            <a:graphic xmlns:a="http://schemas.openxmlformats.org/drawingml/2006/main">
+              <a:graphicData uri="http://schemas.openxmlformats.org/drawingml/2006/picture">
+                <pic:pic xmlns:pic="http://schemas.openxmlformats.org/drawingml/2006/picture">
+                  <pic:nvPicPr>
+                    <pic:cNvPr id="1093486968" name=""/>
+                    <pic:cNvPicPr/>
+                  </pic:nvPicPr>
+                  <pic:blipFill>
+                    <a:blip r:embed="rId7"/>
+                    <a:stretch>
+                      <a:fillRect/>
+                    </a:stretch>
+                  </pic:blipFill>
+                  <pic:spPr>
+                    <a:xfrm>
+                      <a:off x="0" y="0"/>
+                      <a:ext cx="5731510" cy="3054985"/>
+                    </a:xfrm>
+                    <a:prstGeom prst="rect">
+                      <a:avLst/>
+                    </a:prstGeom>
+                  </pic:spPr>
+                </pic:pic>
+              </a:graphicData>
+            </a:graphic>
+          </wp:inline>
+        </w:drawing>
+      </w:r>
+      <w:r>
+        <w:t xml:space="preserve"> </w:t>
+      </w:r>
+    </w:p>
     <w:sectPr>
       <w:pgSz w:w="11906" w:h="16838"/>
       <w:pgMar w:top="1440" w:right="1440" w:bottom="1440" w:left="1440" w:header="720" w:footer="720" w:gutter="0"/>
@@ -704,7 +808,6 @@
   <w:style w:type="character" w:default="1" w:styleId="DefaultParagraphFont">
     <w:name w:val="Default Paragraph Font"/>
     <w:uiPriority w:val="1"/>
-    <w:semiHidden/>
     <w:unhideWhenUsed/>
   </w:style>
   <w:style w:type="table" w:default="1" w:styleId="TableNormal">

</xml_diff>